<commit_message>
Use the real RoboAgentix logo artwork
Replaces the CSS-drawn wordmark with the supplied artwork across both formats.

- assets/logo-light.png — the white transparent original, trimmed to its alpha
  bounding box. Used on the dark cover in the PDF and in the Word cover block.
- assets/logo-dark.png — derived from the white-background artwork by keying
  the white out. The threshold is set so the brand green stays fully opaque
  rather than washing out, with partial alpha only on the anti-aliased edge.
  Used in the running header.

Sized to roughly 40% of page width on the cover and to the header band on
interior pages. The Word cover paragraph deliberately omits w:bidi: a paragraph
holding only a picture has its alignment ignored once bidi is set, which pushed
the logo to the left.

Co-Authored-By: Claude Opus 5 <noreply@anthropic.com>
Claude-Session: https://claude.ai/code/session_01LGW57V8UqhMxtqU6xDR9vv
</commit_message>
<xml_diff>
--- a/proposals/out/RoboAgentix-AWNAK-01-Technical-Proposal-AR.docx
+++ b/proposals/out/RoboAgentix-AWNAK-01-Technical-Proposal-AR.docx
@@ -20,21 +20,43 @@
           </w:tcPr>
           <w:p>
             <w:pPr>
-              <w:bidi w:val="1"/>
-              <w:spacing w:after="520"/>
-              <w:jc w:val="right"/>
-            </w:pPr>
-            <w:r/>
-            <w:r>
-              <w:rPr>
-                <w:rFonts w:ascii="Tajawal" w:hAnsi="Tajawal" w:cs="Tajawal"/>
-                <w:b/>
-                <w:color w:val="FFFFFF"/>
-                <w:sz w:val="40"/>
-                <w:szCs w:val="40"/>
-                <w:rtl w:val="1"/>
-              </w:rPr>
-              <w:t>RoboAgentix</w:t>
+              <w:spacing w:after="480"/>
+              <w:jc w:val="right"/>
+            </w:pPr>
+            <w:r/>
+            <w:r>
+              <w:drawing>
+                <wp:inline xmlns:a="http://schemas.openxmlformats.org/drawingml/2006/main" xmlns:pic="http://schemas.openxmlformats.org/drawingml/2006/picture">
+                  <wp:extent cx="2286000" cy="381311"/>
+                  <wp:docPr id="1" name="Picture 1"/>
+                  <wp:cNvGraphicFramePr>
+                    <a:graphicFrameLocks noChangeAspect="1"/>
+                  </wp:cNvGraphicFramePr>
+                  <a:graphic>
+                    <a:graphicData uri="http://schemas.openxmlformats.org/drawingml/2006/picture">
+                      <pic:pic>
+                        <pic:nvPicPr>
+                          <pic:cNvPr id="0" name="logo-light.png"/>
+                          <pic:cNvPicPr/>
+                        </pic:nvPicPr>
+                        <pic:blipFill>
+                          <a:blip r:embed="rId9"/>
+                          <a:stretch>
+                            <a:fillRect/>
+                          </a:stretch>
+                        </pic:blipFill>
+                        <pic:spPr>
+                          <a:xfrm>
+                            <a:off x="0" y="0"/>
+                            <a:ext cx="2286000" cy="381311"/>
+                          </a:xfrm>
+                          <a:prstGeom prst="rect"/>
+                        </pic:spPr>
+                      </pic:pic>
+                    </a:graphicData>
+                  </a:graphic>
+                </wp:inline>
+              </w:drawing>
             </w:r>
           </w:p>
           <w:p>
@@ -16369,7 +16391,7 @@
         <w:drawing>
           <wp:inline xmlns:a="http://schemas.openxmlformats.org/drawingml/2006/main" xmlns:pic="http://schemas.openxmlformats.org/drawingml/2006/picture">
             <wp:extent cx="5852160" cy="487680"/>
-            <wp:docPr id="1" name="Picture 1"/>
+            <wp:docPr id="2" name="Picture 2"/>
             <wp:cNvGraphicFramePr>
               <a:graphicFrameLocks noChangeAspect="1"/>
             </wp:cNvGraphicFramePr>
@@ -16381,7 +16403,7 @@
                     <pic:cNvPicPr/>
                   </pic:nvPicPr>
                   <pic:blipFill>
-                    <a:blip r:embed="rId9"/>
+                    <a:blip r:embed="rId10"/>
                     <a:stretch>
                       <a:fillRect/>
                     </a:stretch>
@@ -17235,7 +17257,7 @@
               <w:drawing>
                 <wp:inline xmlns:a="http://schemas.openxmlformats.org/drawingml/2006/main" xmlns:pic="http://schemas.openxmlformats.org/drawingml/2006/picture">
                   <wp:extent cx="1280160" cy="2770397"/>
-                  <wp:docPr id="2" name="Picture 2"/>
+                  <wp:docPr id="3" name="Picture 3"/>
                   <wp:cNvGraphicFramePr>
                     <a:graphicFrameLocks noChangeAspect="1"/>
                   </wp:cNvGraphicFramePr>
@@ -17244,52 +17266,6 @@
                       <pic:pic>
                         <pic:nvPicPr>
                           <pic:cNvPr id="0" name="01-login.png"/>
-                          <pic:cNvPicPr/>
-                        </pic:nvPicPr>
-                        <pic:blipFill>
-                          <a:blip r:embed="rId10"/>
-                          <a:stretch>
-                            <a:fillRect/>
-                          </a:stretch>
-                        </pic:blipFill>
-                        <pic:spPr>
-                          <a:xfrm>
-                            <a:off x="0" y="0"/>
-                            <a:ext cx="1280160" cy="2770397"/>
-                          </a:xfrm>
-                          <a:prstGeom prst="rect"/>
-                        </pic:spPr>
-                      </pic:pic>
-                    </a:graphicData>
-                  </a:graphic>
-                </wp:inline>
-              </w:drawing>
-            </w:r>
-          </w:p>
-        </w:tc>
-        <w:tc>
-          <w:tcPr>
-            <w:tcW w:type="dxa" w:w="2520"/>
-          </w:tcPr>
-          <w:p>
-            <w:pPr>
-              <w:bidi w:val="1"/>
-              <w:jc w:val="right"/>
-            </w:pPr>
-            <w:r/>
-            <w:r>
-              <w:drawing>
-                <wp:inline xmlns:a="http://schemas.openxmlformats.org/drawingml/2006/main" xmlns:pic="http://schemas.openxmlformats.org/drawingml/2006/picture">
-                  <wp:extent cx="1280160" cy="2770397"/>
-                  <wp:docPr id="3" name="Picture 3"/>
-                  <wp:cNvGraphicFramePr>
-                    <a:graphicFrameLocks noChangeAspect="1"/>
-                  </wp:cNvGraphicFramePr>
-                  <a:graphic>
-                    <a:graphicData uri="http://schemas.openxmlformats.org/drawingml/2006/picture">
-                      <pic:pic>
-                        <pic:nvPicPr>
-                          <pic:cNvPr id="0" name="02-phone.png"/>
                           <pic:cNvPicPr/>
                         </pic:nvPicPr>
                         <pic:blipFill>
@@ -17335,7 +17311,7 @@
                     <a:graphicData uri="http://schemas.openxmlformats.org/drawingml/2006/picture">
                       <pic:pic>
                         <pic:nvPicPr>
-                          <pic:cNvPr id="0" name="03-otp.png"/>
+                          <pic:cNvPr id="0" name="02-phone.png"/>
                           <pic:cNvPicPr/>
                         </pic:nvPicPr>
                         <pic:blipFill>
@@ -17381,11 +17357,57 @@
                     <a:graphicData uri="http://schemas.openxmlformats.org/drawingml/2006/picture">
                       <pic:pic>
                         <pic:nvPicPr>
+                          <pic:cNvPr id="0" name="03-otp.png"/>
+                          <pic:cNvPicPr/>
+                        </pic:nvPicPr>
+                        <pic:blipFill>
+                          <a:blip r:embed="rId13"/>
+                          <a:stretch>
+                            <a:fillRect/>
+                          </a:stretch>
+                        </pic:blipFill>
+                        <pic:spPr>
+                          <a:xfrm>
+                            <a:off x="0" y="0"/>
+                            <a:ext cx="1280160" cy="2770397"/>
+                          </a:xfrm>
+                          <a:prstGeom prst="rect"/>
+                        </pic:spPr>
+                      </pic:pic>
+                    </a:graphicData>
+                  </a:graphic>
+                </wp:inline>
+              </w:drawing>
+            </w:r>
+          </w:p>
+        </w:tc>
+        <w:tc>
+          <w:tcPr>
+            <w:tcW w:type="dxa" w:w="2520"/>
+          </w:tcPr>
+          <w:p>
+            <w:pPr>
+              <w:bidi w:val="1"/>
+              <w:jc w:val="right"/>
+            </w:pPr>
+            <w:r/>
+            <w:r>
+              <w:drawing>
+                <wp:inline xmlns:a="http://schemas.openxmlformats.org/drawingml/2006/main" xmlns:pic="http://schemas.openxmlformats.org/drawingml/2006/picture">
+                  <wp:extent cx="1280160" cy="2770397"/>
+                  <wp:docPr id="6" name="Picture 6"/>
+                  <wp:cNvGraphicFramePr>
+                    <a:graphicFrameLocks noChangeAspect="1"/>
+                  </wp:cNvGraphicFramePr>
+                  <a:graphic>
+                    <a:graphicData uri="http://schemas.openxmlformats.org/drawingml/2006/picture">
+                      <pic:pic>
+                        <pic:nvPicPr>
                           <pic:cNvPr id="0" name="04-profile.png"/>
                           <pic:cNvPicPr/>
                         </pic:nvPicPr>
                         <pic:blipFill>
-                          <a:blip r:embed="rId13"/>
+                          <a:blip r:embed="rId14"/>
                           <a:stretch>
                             <a:fillRect/>
                           </a:stretch>
@@ -17538,7 +17560,7 @@
               <w:drawing>
                 <wp:inline xmlns:a="http://schemas.openxmlformats.org/drawingml/2006/main" xmlns:pic="http://schemas.openxmlformats.org/drawingml/2006/picture">
                   <wp:extent cx="1280160" cy="2770397"/>
-                  <wp:docPr id="6" name="Picture 6"/>
+                  <wp:docPr id="7" name="Picture 7"/>
                   <wp:cNvGraphicFramePr>
                     <a:graphicFrameLocks noChangeAspect="1"/>
                   </wp:cNvGraphicFramePr>
@@ -17547,52 +17569,6 @@
                       <pic:pic>
                         <pic:nvPicPr>
                           <pic:cNvPr id="0" name="05-home.png"/>
-                          <pic:cNvPicPr/>
-                        </pic:nvPicPr>
-                        <pic:blipFill>
-                          <a:blip r:embed="rId14"/>
-                          <a:stretch>
-                            <a:fillRect/>
-                          </a:stretch>
-                        </pic:blipFill>
-                        <pic:spPr>
-                          <a:xfrm>
-                            <a:off x="0" y="0"/>
-                            <a:ext cx="1280160" cy="2770397"/>
-                          </a:xfrm>
-                          <a:prstGeom prst="rect"/>
-                        </pic:spPr>
-                      </pic:pic>
-                    </a:graphicData>
-                  </a:graphic>
-                </wp:inline>
-              </w:drawing>
-            </w:r>
-          </w:p>
-        </w:tc>
-        <w:tc>
-          <w:tcPr>
-            <w:tcW w:type="dxa" w:w="2520"/>
-          </w:tcPr>
-          <w:p>
-            <w:pPr>
-              <w:bidi w:val="1"/>
-              <w:jc w:val="right"/>
-            </w:pPr>
-            <w:r/>
-            <w:r>
-              <w:drawing>
-                <wp:inline xmlns:a="http://schemas.openxmlformats.org/drawingml/2006/main" xmlns:pic="http://schemas.openxmlformats.org/drawingml/2006/picture">
-                  <wp:extent cx="1280160" cy="2770397"/>
-                  <wp:docPr id="7" name="Picture 7"/>
-                  <wp:cNvGraphicFramePr>
-                    <a:graphicFrameLocks noChangeAspect="1"/>
-                  </wp:cNvGraphicFramePr>
-                  <a:graphic>
-                    <a:graphicData uri="http://schemas.openxmlformats.org/drawingml/2006/picture">
-                      <pic:pic>
-                        <pic:nvPicPr>
-                          <pic:cNvPr id="0" name="06-categories.png"/>
                           <pic:cNvPicPr/>
                         </pic:nvPicPr>
                         <pic:blipFill>
@@ -17638,7 +17614,7 @@
                     <a:graphicData uri="http://schemas.openxmlformats.org/drawingml/2006/picture">
                       <pic:pic>
                         <pic:nvPicPr>
-                          <pic:cNvPr id="0" name="07-wizard.png"/>
+                          <pic:cNvPr id="0" name="06-categories.png"/>
                           <pic:cNvPicPr/>
                         </pic:nvPicPr>
                         <pic:blipFill>
@@ -17684,11 +17660,57 @@
                     <a:graphicData uri="http://schemas.openxmlformats.org/drawingml/2006/picture">
                       <pic:pic>
                         <pic:nvPicPr>
+                          <pic:cNvPr id="0" name="07-wizard.png"/>
+                          <pic:cNvPicPr/>
+                        </pic:nvPicPr>
+                        <pic:blipFill>
+                          <a:blip r:embed="rId17"/>
+                          <a:stretch>
+                            <a:fillRect/>
+                          </a:stretch>
+                        </pic:blipFill>
+                        <pic:spPr>
+                          <a:xfrm>
+                            <a:off x="0" y="0"/>
+                            <a:ext cx="1280160" cy="2770397"/>
+                          </a:xfrm>
+                          <a:prstGeom prst="rect"/>
+                        </pic:spPr>
+                      </pic:pic>
+                    </a:graphicData>
+                  </a:graphic>
+                </wp:inline>
+              </w:drawing>
+            </w:r>
+          </w:p>
+        </w:tc>
+        <w:tc>
+          <w:tcPr>
+            <w:tcW w:type="dxa" w:w="2520"/>
+          </w:tcPr>
+          <w:p>
+            <w:pPr>
+              <w:bidi w:val="1"/>
+              <w:jc w:val="right"/>
+            </w:pPr>
+            <w:r/>
+            <w:r>
+              <w:drawing>
+                <wp:inline xmlns:a="http://schemas.openxmlformats.org/drawingml/2006/main" xmlns:pic="http://schemas.openxmlformats.org/drawingml/2006/picture">
+                  <wp:extent cx="1280160" cy="2770397"/>
+                  <wp:docPr id="10" name="Picture 10"/>
+                  <wp:cNvGraphicFramePr>
+                    <a:graphicFrameLocks noChangeAspect="1"/>
+                  </wp:cNvGraphicFramePr>
+                  <a:graphic>
+                    <a:graphicData uri="http://schemas.openxmlformats.org/drawingml/2006/picture">
+                      <pic:pic>
+                        <pic:nvPicPr>
                           <pic:cNvPr id="0" name="08-waiting.png"/>
                           <pic:cNvPicPr/>
                         </pic:nvPicPr>
                         <pic:blipFill>
-                          <a:blip r:embed="rId17"/>
+                          <a:blip r:embed="rId18"/>
                           <a:stretch>
                             <a:fillRect/>
                           </a:stretch>
@@ -17841,7 +17863,7 @@
               <w:drawing>
                 <wp:inline xmlns:a="http://schemas.openxmlformats.org/drawingml/2006/main" xmlns:pic="http://schemas.openxmlformats.org/drawingml/2006/picture">
                   <wp:extent cx="1280160" cy="2770397"/>
-                  <wp:docPr id="10" name="Picture 10"/>
+                  <wp:docPr id="11" name="Picture 11"/>
                   <wp:cNvGraphicFramePr>
                     <a:graphicFrameLocks noChangeAspect="1"/>
                   </wp:cNvGraphicFramePr>
@@ -17850,52 +17872,6 @@
                       <pic:pic>
                         <pic:nvPicPr>
                           <pic:cNvPr id="0" name="09-quotes.png"/>
-                          <pic:cNvPicPr/>
-                        </pic:nvPicPr>
-                        <pic:blipFill>
-                          <a:blip r:embed="rId18"/>
-                          <a:stretch>
-                            <a:fillRect/>
-                          </a:stretch>
-                        </pic:blipFill>
-                        <pic:spPr>
-                          <a:xfrm>
-                            <a:off x="0" y="0"/>
-                            <a:ext cx="1280160" cy="2770397"/>
-                          </a:xfrm>
-                          <a:prstGeom prst="rect"/>
-                        </pic:spPr>
-                      </pic:pic>
-                    </a:graphicData>
-                  </a:graphic>
-                </wp:inline>
-              </w:drawing>
-            </w:r>
-          </w:p>
-        </w:tc>
-        <w:tc>
-          <w:tcPr>
-            <w:tcW w:type="dxa" w:w="2520"/>
-          </w:tcPr>
-          <w:p>
-            <w:pPr>
-              <w:bidi w:val="1"/>
-              <w:jc w:val="right"/>
-            </w:pPr>
-            <w:r/>
-            <w:r>
-              <w:drawing>
-                <wp:inline xmlns:a="http://schemas.openxmlformats.org/drawingml/2006/main" xmlns:pic="http://schemas.openxmlformats.org/drawingml/2006/picture">
-                  <wp:extent cx="1280160" cy="2770397"/>
-                  <wp:docPr id="11" name="Picture 11"/>
-                  <wp:cNvGraphicFramePr>
-                    <a:graphicFrameLocks noChangeAspect="1"/>
-                  </wp:cNvGraphicFramePr>
-                  <a:graphic>
-                    <a:graphicData uri="http://schemas.openxmlformats.org/drawingml/2006/picture">
-                      <pic:pic>
-                        <pic:nvPicPr>
-                          <pic:cNvPr id="0" name="10-tracking.png"/>
                           <pic:cNvPicPr/>
                         </pic:nvPicPr>
                         <pic:blipFill>
@@ -17941,7 +17917,7 @@
                     <a:graphicData uri="http://schemas.openxmlformats.org/drawingml/2006/picture">
                       <pic:pic>
                         <pic:nvPicPr>
-                          <pic:cNvPr id="0" name="11-chat.png"/>
+                          <pic:cNvPr id="0" name="10-tracking.png"/>
                           <pic:cNvPicPr/>
                         </pic:nvPicPr>
                         <pic:blipFill>
@@ -17987,11 +17963,57 @@
                     <a:graphicData uri="http://schemas.openxmlformats.org/drawingml/2006/picture">
                       <pic:pic>
                         <pic:nvPicPr>
+                          <pic:cNvPr id="0" name="11-chat.png"/>
+                          <pic:cNvPicPr/>
+                        </pic:nvPicPr>
+                        <pic:blipFill>
+                          <a:blip r:embed="rId21"/>
+                          <a:stretch>
+                            <a:fillRect/>
+                          </a:stretch>
+                        </pic:blipFill>
+                        <pic:spPr>
+                          <a:xfrm>
+                            <a:off x="0" y="0"/>
+                            <a:ext cx="1280160" cy="2770397"/>
+                          </a:xfrm>
+                          <a:prstGeom prst="rect"/>
+                        </pic:spPr>
+                      </pic:pic>
+                    </a:graphicData>
+                  </a:graphic>
+                </wp:inline>
+              </w:drawing>
+            </w:r>
+          </w:p>
+        </w:tc>
+        <w:tc>
+          <w:tcPr>
+            <w:tcW w:type="dxa" w:w="2520"/>
+          </w:tcPr>
+          <w:p>
+            <w:pPr>
+              <w:bidi w:val="1"/>
+              <w:jc w:val="right"/>
+            </w:pPr>
+            <w:r/>
+            <w:r>
+              <w:drawing>
+                <wp:inline xmlns:a="http://schemas.openxmlformats.org/drawingml/2006/main" xmlns:pic="http://schemas.openxmlformats.org/drawingml/2006/picture">
+                  <wp:extent cx="1280160" cy="2770397"/>
+                  <wp:docPr id="14" name="Picture 14"/>
+                  <wp:cNvGraphicFramePr>
+                    <a:graphicFrameLocks noChangeAspect="1"/>
+                  </wp:cNvGraphicFramePr>
+                  <a:graphic>
+                    <a:graphicData uri="http://schemas.openxmlformats.org/drawingml/2006/picture">
+                      <pic:pic>
+                        <pic:nvPicPr>
                           <pic:cNvPr id="0" name="12-invoice.png"/>
                           <pic:cNvPicPr/>
                         </pic:nvPicPr>
                         <pic:blipFill>
-                          <a:blip r:embed="rId21"/>
+                          <a:blip r:embed="rId22"/>
                           <a:stretch>
                             <a:fillRect/>
                           </a:stretch>
@@ -18144,7 +18166,7 @@
               <w:drawing>
                 <wp:inline xmlns:a="http://schemas.openxmlformats.org/drawingml/2006/main" xmlns:pic="http://schemas.openxmlformats.org/drawingml/2006/picture">
                   <wp:extent cx="1280160" cy="2770397"/>
-                  <wp:docPr id="14" name="Picture 14"/>
+                  <wp:docPr id="15" name="Picture 15"/>
                   <wp:cNvGraphicFramePr>
                     <a:graphicFrameLocks noChangeAspect="1"/>
                   </wp:cNvGraphicFramePr>
@@ -18153,52 +18175,6 @@
                       <pic:pic>
                         <pic:nvPicPr>
                           <pic:cNvPr id="0" name="13-review.png"/>
-                          <pic:cNvPicPr/>
-                        </pic:nvPicPr>
-                        <pic:blipFill>
-                          <a:blip r:embed="rId22"/>
-                          <a:stretch>
-                            <a:fillRect/>
-                          </a:stretch>
-                        </pic:blipFill>
-                        <pic:spPr>
-                          <a:xfrm>
-                            <a:off x="0" y="0"/>
-                            <a:ext cx="1280160" cy="2770397"/>
-                          </a:xfrm>
-                          <a:prstGeom prst="rect"/>
-                        </pic:spPr>
-                      </pic:pic>
-                    </a:graphicData>
-                  </a:graphic>
-                </wp:inline>
-              </w:drawing>
-            </w:r>
-          </w:p>
-        </w:tc>
-        <w:tc>
-          <w:tcPr>
-            <w:tcW w:type="dxa" w:w="2520"/>
-          </w:tcPr>
-          <w:p>
-            <w:pPr>
-              <w:bidi w:val="1"/>
-              <w:jc w:val="right"/>
-            </w:pPr>
-            <w:r/>
-            <w:r>
-              <w:drawing>
-                <wp:inline xmlns:a="http://schemas.openxmlformats.org/drawingml/2006/main" xmlns:pic="http://schemas.openxmlformats.org/drawingml/2006/picture">
-                  <wp:extent cx="1280160" cy="2770397"/>
-                  <wp:docPr id="15" name="Picture 15"/>
-                  <wp:cNvGraphicFramePr>
-                    <a:graphicFrameLocks noChangeAspect="1"/>
-                  </wp:cNvGraphicFramePr>
-                  <a:graphic>
-                    <a:graphicData uri="http://schemas.openxmlformats.org/drawingml/2006/picture">
-                      <pic:pic>
-                        <pic:nvPicPr>
-                          <pic:cNvPr id="0" name="14-orders.png"/>
                           <pic:cNvPicPr/>
                         </pic:nvPicPr>
                         <pic:blipFill>
@@ -18244,11 +18220,57 @@
                     <a:graphicData uri="http://schemas.openxmlformats.org/drawingml/2006/picture">
                       <pic:pic>
                         <pic:nvPicPr>
+                          <pic:cNvPr id="0" name="14-orders.png"/>
+                          <pic:cNvPicPr/>
+                        </pic:nvPicPr>
+                        <pic:blipFill>
+                          <a:blip r:embed="rId24"/>
+                          <a:stretch>
+                            <a:fillRect/>
+                          </a:stretch>
+                        </pic:blipFill>
+                        <pic:spPr>
+                          <a:xfrm>
+                            <a:off x="0" y="0"/>
+                            <a:ext cx="1280160" cy="2770397"/>
+                          </a:xfrm>
+                          <a:prstGeom prst="rect"/>
+                        </pic:spPr>
+                      </pic:pic>
+                    </a:graphicData>
+                  </a:graphic>
+                </wp:inline>
+              </w:drawing>
+            </w:r>
+          </w:p>
+        </w:tc>
+        <w:tc>
+          <w:tcPr>
+            <w:tcW w:type="dxa" w:w="2520"/>
+          </w:tcPr>
+          <w:p>
+            <w:pPr>
+              <w:bidi w:val="1"/>
+              <w:jc w:val="right"/>
+            </w:pPr>
+            <w:r/>
+            <w:r>
+              <w:drawing>
+                <wp:inline xmlns:a="http://schemas.openxmlformats.org/drawingml/2006/main" xmlns:pic="http://schemas.openxmlformats.org/drawingml/2006/picture">
+                  <wp:extent cx="1280160" cy="2770397"/>
+                  <wp:docPr id="17" name="Picture 17"/>
+                  <wp:cNvGraphicFramePr>
+                    <a:graphicFrameLocks noChangeAspect="1"/>
+                  </wp:cNvGraphicFramePr>
+                  <a:graphic>
+                    <a:graphicData uri="http://schemas.openxmlformats.org/drawingml/2006/picture">
+                      <pic:pic>
+                        <pic:nvPicPr>
                           <pic:cNvPr id="0" name="15-account.png"/>
                           <pic:cNvPicPr/>
                         </pic:nvPicPr>
                         <pic:blipFill>
-                          <a:blip r:embed="rId24"/>
+                          <a:blip r:embed="rId25"/>
                           <a:stretch>
                             <a:fillRect/>
                           </a:stretch>

</xml_diff>